<commit_message>
§10.2 erweitert: 7 dokumentierte Big-Tech-Lobby-Narrative + Quellen [211]–[214]
Punkt 5 'Wahlkampf-Lobbying' → 'Wahlkampf-Lobbying und Deregulierungs-Narrative':
- Tabelle mit 7 Narrativen, Akteuren und Bezwecktem
- 'Datenschutz ist etwas für Gesunde' (Spahn 2016)
- 'Daten nicht zu nutzen tötet Patienten' (Vilsmeier/Brainlab)
- 'DSGVO als Innovationskiller' (Draghi, DigitalEurope, CCIA)
- 'Europa fällt zurück' (Meta AI-Act-Pause-Forderung)
- 'Legitimate Interest reicht für KI' (DigitalEurope, CCIA)
- 'Art. 9 behindert KI im Gesundheitswesen' (Dot Europe)
- 'Disproportionate effort' (Google→Bundesregierung→Digital Omnibus)
Quellen: Corporate Europe Observatory (01/2026, 10/2025), noyb, netzpolitik.org
Wiki, PDF, DOCX aktualisiert (214 Quellen)

https://claude.ai/code/session_01PFeLNnCR3FrQPcaZf8Mc5W
</commit_message>
<xml_diff>
--- a/Wolkenfrei.docx
+++ b/Wolkenfrei.docx
@@ -109,7 +109,7 @@
         <w:t xml:space="preserve"> </w:t>
       </w:r>
       <w:r>
-        <w:t xml:space="preserve">22.0 — April 2026 · 210 Quellen · 19 Kapitel</w:t>
+        <w:t xml:space="preserve">22.0 — April 2026 · 214 Quellen · 19 Kapitel</w:t>
       </w:r>
       <w:r>
         <w:br/>
@@ -22631,7 +22631,7 @@
           <w:bCs/>
           <w:b/>
         </w:rPr>
-        <w:t xml:space="preserve">5. Wahlkampf-Lobbying</w:t>
+        <w:t xml:space="preserve">5. Wahlkampf-Lobbying und Deregulierungs-Narrative</w:t>
       </w:r>
     </w:p>
     <w:p>
@@ -22657,7 +22657,598 @@
         <w:t xml:space="preserve"> </w:t>
       </w:r>
       <w:r>
-        <w:t xml:space="preserve">zu fördern.</w:t>
+        <w:t xml:space="preserve">zu fördern. Dahinter steht ein Set wiederkehrender Lobby-Narrative, die in Positionspapieren, Konferenzbeiträgen und politischen Beratungen systematisch eingesetzt werden:</w:t>
+      </w:r>
+    </w:p>
+    <w:tbl>
+      <w:tblPr>
+        <w:tblStyle w:val="Table"/>
+        <w:tblW w:type="pct" w:w="5000"/>
+        <w:tblLook w:firstRow="1" w:lastRow="0" w:firstColumn="0" w:lastColumn="0" w:noHBand="0" w:noVBand="0" w:val="0020"/>
+        <w:jc w:val="start"/>
+      </w:tblPr>
+      <w:tblGrid>
+        <w:gridCol w:w="2640"/>
+        <w:gridCol w:w="2640"/>
+        <w:gridCol w:w="2640"/>
+      </w:tblGrid>
+      <w:tr>
+        <w:trPr>
+          <w:tblHeader w:val="true"/>
+        </w:trPr>
+        <w:tc>
+          <w:tcPr/>
+          <w:p>
+            <w:pPr>
+              <w:pStyle w:val="Compact"/>
+              <w:jc w:val="left"/>
+            </w:pPr>
+            <w:r>
+              <w:t xml:space="preserve">Narrativ</w:t>
+            </w:r>
+          </w:p>
+        </w:tc>
+        <w:tc>
+          <w:tcPr/>
+          <w:p>
+            <w:pPr>
+              <w:pStyle w:val="Compact"/>
+              <w:jc w:val="left"/>
+            </w:pPr>
+            <w:r>
+              <w:t xml:space="preserve">Wer es nutzt</w:t>
+            </w:r>
+          </w:p>
+        </w:tc>
+        <w:tc>
+          <w:tcPr/>
+          <w:p>
+            <w:pPr>
+              <w:pStyle w:val="Compact"/>
+              <w:jc w:val="left"/>
+            </w:pPr>
+            <w:r>
+              <w:t xml:space="preserve">Was es bezweckt</w:t>
+            </w:r>
+          </w:p>
+        </w:tc>
+      </w:tr>
+      <w:tr>
+        <w:tc>
+          <w:tcPr/>
+          <w:p>
+            <w:pPr>
+              <w:pStyle w:val="Compact"/>
+              <w:jc w:val="left"/>
+            </w:pPr>
+            <w:r>
+              <w:rPr>
+                <w:bCs/>
+                <w:b/>
+              </w:rPr>
+              <w:t xml:space="preserve">“</w:t>
+            </w:r>
+            <w:r>
+              <w:rPr>
+                <w:bCs/>
+                <w:b/>
+              </w:rPr>
+              <w:t xml:space="preserve">Datenschutz ist etwas für Gesunde</w:t>
+            </w:r>
+            <w:r>
+              <w:rPr>
+                <w:bCs/>
+                <w:b/>
+              </w:rPr>
+              <w:t xml:space="preserve">”</w:t>
+            </w:r>
+          </w:p>
+        </w:tc>
+        <w:tc>
+          <w:tcPr/>
+          <w:p>
+            <w:pPr>
+              <w:pStyle w:val="Compact"/>
+              <w:jc w:val="left"/>
+            </w:pPr>
+            <w:r>
+              <w:t xml:space="preserve">Jens Spahn (2016, als Staatssekretär BMF); Brainlab-CEO Stefan Vilsmeier:</w:t>
+            </w:r>
+            <w:r>
+              <w:t xml:space="preserve"> </w:t>
+            </w:r>
+            <w:r>
+              <w:t xml:space="preserve">“</w:t>
+            </w:r>
+            <w:r>
+              <w:t xml:space="preserve">Daten nicht zu nutzen tötet Patienten im großen Stil</w:t>
+            </w:r>
+            <w:r>
+              <w:t xml:space="preserve">”</w:t>
+            </w:r>
+          </w:p>
+        </w:tc>
+        <w:tc>
+          <w:tcPr/>
+          <w:p>
+            <w:pPr>
+              <w:pStyle w:val="Compact"/>
+              <w:jc w:val="left"/>
+            </w:pPr>
+            <w:r>
+              <w:t xml:space="preserve">Datenschutz als Hindernis für Gesundheitsforschung framen; emotionale Druckkulisse für Lockerung von Art. 9 DSGVO</w:t>
+            </w:r>
+          </w:p>
+        </w:tc>
+      </w:tr>
+      <w:tr>
+        <w:tc>
+          <w:tcPr/>
+          <w:p>
+            <w:pPr>
+              <w:pStyle w:val="Compact"/>
+              <w:jc w:val="left"/>
+            </w:pPr>
+            <w:r>
+              <w:rPr>
+                <w:bCs/>
+                <w:b/>
+              </w:rPr>
+              <w:t xml:space="preserve">“</w:t>
+            </w:r>
+            <w:r>
+              <w:rPr>
+                <w:bCs/>
+                <w:b/>
+              </w:rPr>
+              <w:t xml:space="preserve">DSGVO als Innovationskiller</w:t>
+            </w:r>
+            <w:r>
+              <w:rPr>
+                <w:bCs/>
+                <w:b/>
+              </w:rPr>
+              <w:t xml:space="preserve">”</w:t>
+            </w:r>
+          </w:p>
+        </w:tc>
+        <w:tc>
+          <w:tcPr/>
+          <w:p>
+            <w:pPr>
+              <w:pStyle w:val="Compact"/>
+              <w:jc w:val="left"/>
+            </w:pPr>
+            <w:r>
+              <w:t xml:space="preserve">Mario Draghi (EU-Berater, 2025); DigitalEurope; CCIA</w:t>
+            </w:r>
+          </w:p>
+        </w:tc>
+        <w:tc>
+          <w:tcPr/>
+          <w:p>
+            <w:pPr>
+              <w:pStyle w:val="Compact"/>
+              <w:jc w:val="left"/>
+            </w:pPr>
+            <w:r>
+              <w:t xml:space="preserve">Falsche Dichotomie Regulierung vs. Innovation; verschweigt, dass regulierte Märkte (Pharma, Finanzsektor) Innovationsführer sind</w:t>
+            </w:r>
+          </w:p>
+        </w:tc>
+      </w:tr>
+      <w:tr>
+        <w:tc>
+          <w:tcPr/>
+          <w:p>
+            <w:pPr>
+              <w:pStyle w:val="Compact"/>
+              <w:jc w:val="left"/>
+            </w:pPr>
+            <w:r>
+              <w:rPr>
+                <w:bCs/>
+                <w:b/>
+              </w:rPr>
+              <w:t xml:space="preserve">“</w:t>
+            </w:r>
+            <w:r>
+              <w:rPr>
+                <w:bCs/>
+                <w:b/>
+              </w:rPr>
+              <w:t xml:space="preserve">Europa fällt zurück</w:t>
+            </w:r>
+            <w:r>
+              <w:rPr>
+                <w:bCs/>
+                <w:b/>
+              </w:rPr>
+              <w:t xml:space="preserve">”</w:t>
+            </w:r>
+          </w:p>
+        </w:tc>
+        <w:tc>
+          <w:tcPr/>
+          <w:p>
+            <w:pPr>
+              <w:pStyle w:val="Compact"/>
+              <w:jc w:val="left"/>
+            </w:pPr>
+            <w:r>
+              <w:t xml:space="preserve">Meta:</w:t>
+            </w:r>
+            <w:r>
+              <w:t xml:space="preserve"> </w:t>
+            </w:r>
+            <w:r>
+              <w:t xml:space="preserve">“</w:t>
+            </w:r>
+            <w:r>
+              <w:t xml:space="preserve">Critical to first pause the implementation and enforcement of the AI Act…risking the EU falling behind in the global AI race</w:t>
+            </w:r>
+            <w:r>
+              <w:t xml:space="preserve">”</w:t>
+            </w:r>
+          </w:p>
+        </w:tc>
+        <w:tc>
+          <w:tcPr/>
+          <w:p>
+            <w:pPr>
+              <w:pStyle w:val="Compact"/>
+              <w:jc w:val="left"/>
+            </w:pPr>
+            <w:r>
+              <w:t xml:space="preserve">Geopolitische Angst als Hebel für Deregulierung; verschweigt, dass US-Tech-Konzerne</w:t>
+            </w:r>
+            <w:r>
+              <w:t xml:space="preserve"> </w:t>
+            </w:r>
+            <w:r>
+              <w:rPr>
+                <w:bCs/>
+                <w:b/>
+              </w:rPr>
+              <w:t xml:space="preserve">in</w:t>
+            </w:r>
+            <w:r>
+              <w:t xml:space="preserve"> </w:t>
+            </w:r>
+            <w:r>
+              <w:t xml:space="preserve">Europa reguliert werden wollen, nicht</w:t>
+            </w:r>
+            <w:r>
+              <w:t xml:space="preserve"> </w:t>
+            </w:r>
+            <w:r>
+              <w:rPr>
+                <w:bCs/>
+                <w:b/>
+              </w:rPr>
+              <w:t xml:space="preserve">von</w:t>
+            </w:r>
+            <w:r>
+              <w:t xml:space="preserve"> </w:t>
+            </w:r>
+            <w:r>
+              <w:t xml:space="preserve">Europa</w:t>
+            </w:r>
+          </w:p>
+        </w:tc>
+      </w:tr>
+      <w:tr>
+        <w:tc>
+          <w:tcPr/>
+          <w:p>
+            <w:pPr>
+              <w:pStyle w:val="Compact"/>
+              <w:jc w:val="left"/>
+            </w:pPr>
+            <w:r>
+              <w:rPr>
+                <w:bCs/>
+                <w:b/>
+              </w:rPr>
+              <w:t xml:space="preserve">“</w:t>
+            </w:r>
+            <w:r>
+              <w:rPr>
+                <w:bCs/>
+                <w:b/>
+              </w:rPr>
+              <w:t xml:space="preserve">Legitimate Interest reicht für KI</w:t>
+            </w:r>
+            <w:r>
+              <w:rPr>
+                <w:bCs/>
+                <w:b/>
+              </w:rPr>
+              <w:t xml:space="preserve">”</w:t>
+            </w:r>
+          </w:p>
+        </w:tc>
+        <w:tc>
+          <w:tcPr/>
+          <w:p>
+            <w:pPr>
+              <w:pStyle w:val="Compact"/>
+              <w:jc w:val="left"/>
+            </w:pPr>
+            <w:r>
+              <w:t xml:space="preserve">DigitalEurope:</w:t>
+            </w:r>
+            <w:r>
+              <w:t xml:space="preserve"> </w:t>
+            </w:r>
+            <w:r>
+              <w:t xml:space="preserve">“</w:t>
+            </w:r>
+            <w:r>
+              <w:t xml:space="preserve">Reinforce the use of</w:t>
+            </w:r>
+            <w:r>
+              <w:t xml:space="preserve"> </w:t>
+            </w:r>
+            <w:r>
+              <w:t xml:space="preserve">‘</w:t>
+            </w:r>
+            <w:r>
+              <w:t xml:space="preserve">legitimate interest</w:t>
+            </w:r>
+            <w:r>
+              <w:t xml:space="preserve">’</w:t>
+            </w:r>
+            <w:r>
+              <w:t xml:space="preserve"> </w:t>
+            </w:r>
+            <w:r>
+              <w:t xml:space="preserve">as a ground to process personal data for key use cases such as product development — including of AI models</w:t>
+            </w:r>
+            <w:r>
+              <w:t xml:space="preserve">”</w:t>
+            </w:r>
+            <w:r>
+              <w:t xml:space="preserve">; CCIA</w:t>
+            </w:r>
+          </w:p>
+        </w:tc>
+        <w:tc>
+          <w:tcPr/>
+          <w:p>
+            <w:pPr>
+              <w:pStyle w:val="Compact"/>
+              <w:jc w:val="left"/>
+            </w:pPr>
+            <w:r>
+              <w:t xml:space="preserve">Art. 6 Abs. 1 lit. f DSGVO als Universalschlüssel für KI-Training mit personenbezogenen Daten; untergräbt Art. 9 (Gesundheitsdaten)</w:t>
+            </w:r>
+          </w:p>
+        </w:tc>
+      </w:tr>
+      <w:tr>
+        <w:tc>
+          <w:tcPr/>
+          <w:p>
+            <w:pPr>
+              <w:pStyle w:val="Compact"/>
+              <w:jc w:val="left"/>
+            </w:pPr>
+            <w:r>
+              <w:rPr>
+                <w:bCs/>
+                <w:b/>
+              </w:rPr>
+              <w:t xml:space="preserve">“</w:t>
+            </w:r>
+            <w:r>
+              <w:rPr>
+                <w:bCs/>
+                <w:b/>
+              </w:rPr>
+              <w:t xml:space="preserve">Art. 9 DSGVO behindert KI im Gesundheitswesen</w:t>
+            </w:r>
+            <w:r>
+              <w:rPr>
+                <w:bCs/>
+                <w:b/>
+              </w:rPr>
+              <w:t xml:space="preserve">”</w:t>
+            </w:r>
+          </w:p>
+        </w:tc>
+        <w:tc>
+          <w:tcPr/>
+          <w:p>
+            <w:pPr>
+              <w:pStyle w:val="Compact"/>
+              <w:jc w:val="left"/>
+            </w:pPr>
+            <w:r>
+              <w:t xml:space="preserve">Dot Europe (Big-Tech-Lobbyorganisation) an dänische Regierung:</w:t>
+            </w:r>
+            <w:r>
+              <w:t xml:space="preserve"> </w:t>
+            </w:r>
+            <w:r>
+              <w:t xml:space="preserve">“</w:t>
+            </w:r>
+            <w:r>
+              <w:t xml:space="preserve">GDPR Article 9 strictly limits the processing of special category data…posing challenges for AI development, particularly in healthcare</w:t>
+            </w:r>
+            <w:r>
+              <w:t xml:space="preserve">”</w:t>
+            </w:r>
+          </w:p>
+        </w:tc>
+        <w:tc>
+          <w:tcPr/>
+          <w:p>
+            <w:pPr>
+              <w:pStyle w:val="Compact"/>
+              <w:jc w:val="left"/>
+            </w:pPr>
+            <w:r>
+              <w:t xml:space="preserve">Direkte Forderung nach Lockerung des Schutzes für Gesundheitsdaten; verpackt als KI-Qualitätssicherung</w:t>
+            </w:r>
+          </w:p>
+        </w:tc>
+      </w:tr>
+      <w:tr>
+        <w:tc>
+          <w:tcPr/>
+          <w:p>
+            <w:pPr>
+              <w:pStyle w:val="Compact"/>
+              <w:jc w:val="left"/>
+            </w:pPr>
+            <w:r>
+              <w:rPr>
+                <w:bCs/>
+                <w:b/>
+              </w:rPr>
+              <w:t xml:space="preserve">“</w:t>
+            </w:r>
+            <w:r>
+              <w:rPr>
+                <w:bCs/>
+                <w:b/>
+              </w:rPr>
+              <w:t xml:space="preserve">Vereinfachung</w:t>
+            </w:r>
+            <w:r>
+              <w:rPr>
+                <w:bCs/>
+                <w:b/>
+              </w:rPr>
+              <w:t xml:space="preserve">”</w:t>
+            </w:r>
+            <w:r>
+              <w:rPr>
+                <w:bCs/>
+                <w:b/>
+              </w:rPr>
+              <w:t xml:space="preserve"> </w:t>
+            </w:r>
+            <w:r>
+              <w:rPr>
+                <w:bCs/>
+                <w:b/>
+              </w:rPr>
+              <w:t xml:space="preserve">statt Deregulierung</w:t>
+            </w:r>
+          </w:p>
+        </w:tc>
+        <w:tc>
+          <w:tcPr/>
+          <w:p>
+            <w:pPr>
+              <w:pStyle w:val="Compact"/>
+              <w:jc w:val="left"/>
+            </w:pPr>
+            <w:r>
+              <w:t xml:space="preserve">EU-Kommission (Digital Omnibus, November 2025):</w:t>
+            </w:r>
+            <w:r>
+              <w:t xml:space="preserve"> </w:t>
+            </w:r>
+            <w:r>
+              <w:t xml:space="preserve">“</w:t>
+            </w:r>
+            <w:r>
+              <w:t xml:space="preserve">simplify the EU’s Digital Rulebook</w:t>
+            </w:r>
+            <w:r>
+              <w:t xml:space="preserve">”</w:t>
+            </w:r>
+          </w:p>
+        </w:tc>
+        <w:tc>
+          <w:tcPr/>
+          <w:p>
+            <w:pPr>
+              <w:pStyle w:val="Compact"/>
+              <w:jc w:val="left"/>
+            </w:pPr>
+            <w:r>
+              <w:t xml:space="preserve">Framing verschleiert, dass die meisten Artikel komplexer werden und Schlupflöcher entstehen, die nur große Konzerne nutzen können (noyb-Analyse)</w:t>
+            </w:r>
+          </w:p>
+        </w:tc>
+      </w:tr>
+      <w:tr>
+        <w:tc>
+          <w:tcPr/>
+          <w:p>
+            <w:pPr>
+              <w:pStyle w:val="Compact"/>
+              <w:jc w:val="left"/>
+            </w:pPr>
+            <w:r>
+              <w:rPr>
+                <w:bCs/>
+                <w:b/>
+              </w:rPr>
+              <w:t xml:space="preserve">“</w:t>
+            </w:r>
+            <w:r>
+              <w:rPr>
+                <w:bCs/>
+                <w:b/>
+              </w:rPr>
+              <w:t xml:space="preserve">Disproportionate effort</w:t>
+            </w:r>
+            <w:r>
+              <w:rPr>
+                <w:bCs/>
+                <w:b/>
+              </w:rPr>
+              <w:t xml:space="preserve">”</w:t>
+            </w:r>
+          </w:p>
+        </w:tc>
+        <w:tc>
+          <w:tcPr/>
+          <w:p>
+            <w:pPr>
+              <w:pStyle w:val="Compact"/>
+              <w:jc w:val="left"/>
+            </w:pPr>
+            <w:r>
+              <w:t xml:space="preserve">Google (Lobbypapier an Bundesregierung, August 2025) → wortgleich in Bundesregierungs-Positionspapier → wortgleich im Digital-Omnibus-Entwurf</w:t>
+            </w:r>
+          </w:p>
+        </w:tc>
+        <w:tc>
+          <w:tcPr/>
+          <w:p>
+            <w:pPr>
+              <w:pStyle w:val="Compact"/>
+              <w:jc w:val="left"/>
+            </w:pPr>
+            <w:r>
+              <w:t xml:space="preserve">Einschränkung des DSGVO-Auskunftsrechts (Art. 15–22); dokumentierter 1:1-Lobbyerfolg</w:t>
+            </w:r>
+          </w:p>
+        </w:tc>
+      </w:tr>
+    </w:tbl>
+    <w:p>
+      <w:pPr>
+        <w:pStyle w:val="BodyText"/>
+      </w:pPr>
+      <w:r>
+        <w:rPr>
+          <w:bCs/>
+          <w:b/>
+        </w:rPr>
+        <w:t xml:space="preserve">Das Muster:</w:t>
+      </w:r>
+      <w:r>
+        <w:t xml:space="preserve"> </w:t>
+      </w:r>
+      <w:r>
+        <w:t xml:space="preserve">Jedes dieser Narrative adressiert ein reales Problem (KI braucht Daten, Bürokratie ist real, Gesundheitsforschung ist wichtig) — und leitet daraus eine unverhältnismäßige Schlussfolgerung ab (also müssen Grundrechte weichen). Die Corporate Europe Observatory dokumentierte im Januar 2026 Artikel für Artikel, wie Big-Tech-Forderungen in den Digital Omnibus eingeflossen sind — in sieben Fällen deckungsgleich mit Lobbypapieren.</w:t>
       </w:r>
     </w:p>
     <w:bookmarkEnd w:id="103"/>
@@ -41894,6 +42485,129 @@
       </w:r>
     </w:p>
     <w:p>
+      <w:pPr>
+        <w:numPr>
+          <w:ilvl w:val="0"/>
+          <w:numId w:val="1044"/>
+        </w:numPr>
+        <w:pStyle w:val="Compact"/>
+      </w:pPr>
+      <w:r>
+        <w:t xml:space="preserve">[211] Corporate Europe Observatory:</w:t>
+      </w:r>
+      <w:r>
+        <w:t xml:space="preserve"> </w:t>
+      </w:r>
+      <w:r>
+        <w:t xml:space="preserve">“</w:t>
+      </w:r>
+      <w:r>
+        <w:t xml:space="preserve">Article by article, how Big Tech shaped the EU’s roll-back of digital rights</w:t>
+      </w:r>
+      <w:r>
+        <w:t xml:space="preserve">”</w:t>
+      </w:r>
+      <w:r>
+        <w:t xml:space="preserve">, Januar 2026. Dokumentiert 7 Fälle deckungsgleicher Übernahme von Big-Tech-Lobbyforderungen in den Digital Omnibus: https://corporateeurope.org/en/2026/01/article-article-how-big-tech-shaped-eus-roll-back-digital-rights</w:t>
+      </w:r>
+    </w:p>
+    <w:p>
+      <w:pPr>
+        <w:numPr>
+          <w:ilvl w:val="0"/>
+          <w:numId w:val="1044"/>
+        </w:numPr>
+        <w:pStyle w:val="Compact"/>
+      </w:pPr>
+      <w:r>
+        <w:t xml:space="preserve">[212] Corporate Europe Observatory / LobbyControl:</w:t>
+      </w:r>
+      <w:r>
+        <w:t xml:space="preserve"> </w:t>
+      </w:r>
+      <w:r>
+        <w:t xml:space="preserve">“</w:t>
+      </w:r>
+      <w:r>
+        <w:t xml:space="preserve">Tech industry now spending record €151 million on lobbying the EU</w:t>
+      </w:r>
+      <w:r>
+        <w:t xml:space="preserve">”</w:t>
+      </w:r>
+      <w:r>
+        <w:t xml:space="preserve">, Oktober 2025. 890 Lobbyisten, 437 Parlamentsausweise, 3 Treffen/Tag: https://corporateeurope.org/en/2025/10/revealed-tech-industry-now-spending-record-eu151-million-lobbying-eu</w:t>
+      </w:r>
+    </w:p>
+    <w:p>
+      <w:pPr>
+        <w:numPr>
+          <w:ilvl w:val="0"/>
+          <w:numId w:val="1044"/>
+        </w:numPr>
+        <w:pStyle w:val="Compact"/>
+      </w:pPr>
+      <w:r>
+        <w:t xml:space="preserve">[213] noyb:</w:t>
+      </w:r>
+      <w:r>
+        <w:t xml:space="preserve"> </w:t>
+      </w:r>
+      <w:r>
+        <w:t xml:space="preserve">“</w:t>
+      </w:r>
+      <w:r>
+        <w:t xml:space="preserve">Digital Omnibus: EU Commission wants to wreck core GDPR principles</w:t>
+      </w:r>
+      <w:r>
+        <w:t xml:space="preserve">”</w:t>
+      </w:r>
+      <w:r>
+        <w:t xml:space="preserve">, 2025. Analyse der DSGVO-Aufweichungen im Digital Omnibus: https://noyb.eu/en/digital-omnibus-eu-commission-wants-wreck-core-gdpr-principles</w:t>
+      </w:r>
+    </w:p>
+    <w:p>
+      <w:pPr>
+        <w:numPr>
+          <w:ilvl w:val="0"/>
+          <w:numId w:val="1044"/>
+        </w:numPr>
+        <w:pStyle w:val="Compact"/>
+      </w:pPr>
+      <w:r>
+        <w:t xml:space="preserve">[214] netzpolitik.org:</w:t>
+      </w:r>
+      <w:r>
+        <w:t xml:space="preserve"> </w:t>
+      </w:r>
+      <w:r>
+        <w:t xml:space="preserve">“</w:t>
+      </w:r>
+      <w:r>
+        <w:t xml:space="preserve">Datenschutzkritik: Jens Spahn versucht, sein eigenes Versagen zu verschleiern</w:t>
+      </w:r>
+      <w:r>
+        <w:t xml:space="preserve">”</w:t>
+      </w:r>
+      <w:r>
+        <w:t xml:space="preserve">, 2021. Spahn-Narrativ</w:t>
+      </w:r>
+      <w:r>
+        <w:t xml:space="preserve"> </w:t>
+      </w:r>
+      <w:r>
+        <w:t xml:space="preserve">“</w:t>
+      </w:r>
+      <w:r>
+        <w:t xml:space="preserve">Datenschutz ist etwas für Gesunde</w:t>
+      </w:r>
+      <w:r>
+        <w:t xml:space="preserve">”</w:t>
+      </w:r>
+      <w:r>
+        <w:t xml:space="preserve">: https://netzpolitik.org/2021/datenschutzkritik-jens-spahn-versucht-sein-eigenes-versagen-zu-verschleiern/</w:t>
+      </w:r>
+    </w:p>
+    <w:p>
       <w:r>
         <w:pict>
           <v:rect style="width:0;height:1.5pt" o:hralign="center" o:hrstd="t" o:hr="t"/>
@@ -41909,7 +42623,7 @@
           <w:iCs/>
           <w:i/>
         </w:rPr>
-        <w:t xml:space="preserve">Dieses Dokument basiert ausschließlich auf öffentlich zugänglichen Quellen, wurde mit Claude (Anthropic) erstellt. Version 22.0, April 2026. 210 Quellen. 19 Kapitel. Es stellt keine Rechtsberatung dar.</w:t>
+        <w:t xml:space="preserve">Dieses Dokument basiert ausschließlich auf öffentlich zugänglichen Quellen, wurde mit Claude (Anthropic) erstellt. Version 22.0, April 2026. 214 Quellen. 19 Kapitel. Es stellt keine Rechtsberatung dar.</w:t>
       </w:r>
     </w:p>
     <w:bookmarkEnd w:id="182"/>

</xml_diff>

<commit_message>
§1.2.1 umgeschrieben: Sogwirkung statt Lock-in-Perspektive
Bisherige Formulierung suggerierte, Institutionen müssten von AWS/Azure weg.
Realität: GKVen und Kliniken migrieren gerade erst HIN zu Azure/AWS/OCI.
Neue Struktur:
1. Konkreter Einstiegstrend (KVNO→Azure, Kubus IT→Google, Kliniken→OCI)
2. Warum: Service-Tiefe, Ökosystem, § 393 Erlaubnis, Hyperscaler-Vertrieb
3. Lock-in als Zukunftsproblem (12-24 Monate → Mehrjahresabhängigkeit)
4. Verweis auf §17.3 (Migrationsstrategie) und §17.6 (Exit-Strategie)
Wiki, PDF, DOCX aktualisiert

https://claude.ai/code/session_01PFeLNnCR3FrQPcaZf8Mc5W
</commit_message>
<xml_diff>
--- a/Wolkenfrei.docx
+++ b/Wolkenfrei.docx
@@ -1204,13 +1204,13 @@
         <w:t xml:space="preserve">1.2 Warum es trotzdem passiert — sieben Realitätsgründe</w:t>
       </w:r>
     </w:p>
-    <w:bookmarkStart w:id="23" w:name="Xb3f35d23d21b00daa43923e9e7e41c9a4dc201e"/>
+    <w:bookmarkStart w:id="23" w:name="Xd0e28e2283a07b54469f059c06d17bc3925b817"/>
     <w:p>
       <w:pPr>
         <w:pStyle w:val="Heading4"/>
       </w:pPr>
       <w:r>
-        <w:t xml:space="preserve">1.2.1 Pragmatismus — Service-Tiefe und Ökosystem-Lock-in</w:t>
+        <w:t xml:space="preserve">1.2.1 Pragmatismus — Service-Tiefe und Ökosystem-Sogwirkung</w:t>
       </w:r>
     </w:p>
     <w:p>
@@ -1218,7 +1218,55 @@
         <w:pStyle w:val="FirstParagraph"/>
       </w:pPr>
       <w:r>
-        <w:t xml:space="preserve">EU-Anbieter können heute für GKV- und Klinik-Kernworkloads skalieren — die Kapazitätslücke ist nicht das Hauptproblem. Das eigentliche Hindernis ist die Service-Tiefe: AWS und Azure bieten je über 200 verwaltete Dienste (Managed Databases, Serverless, IoT/Edge, DevOps-Toolchains, Data Warehouse, globale CDN) — EU-Anbieter wie STACKIT bieten 40–60 Kernservices. Architekturen, die tief in AWS- oder Azure-Managed-Services eingebaut sind, lassen sich nicht einfach migrieren. Hinzu kommt das Ökosystem-Problem: Azure ist kein einzelner Dienst, sondern 15–20 integrierte Schichten — E-Mail, Identity, Collaboration, Datenbanken, KI. Wer alle ersetzt, baut neu. Wer nur einzelne ersetzt, hat hybride Komplexität. Details in Kapitel 7 und 8.</w:t>
+        <w:t xml:space="preserve">Die meisten Gesundheitsinstitutionen stehen nicht vor der Frage, wie sie aus einer US-Cloud herauskommen — sie steigen gerade erst ein. Die KVNO baut ihre KI-Plattform auf Azure (TED 98706-2026). Kubus IT migriert GKV-Infrastruktur über Arvato zu Google Cloud. Kliniken evaluieren Oracle Cerner auf OCI. Der Trend ist nicht Migration</w:t>
+      </w:r>
+      <w:r>
+        <w:t xml:space="preserve"> </w:t>
+      </w:r>
+      <w:r>
+        <w:rPr>
+          <w:iCs/>
+          <w:i/>
+        </w:rPr>
+        <w:t xml:space="preserve">weg von</w:t>
+      </w:r>
+      <w:r>
+        <w:t xml:space="preserve"> </w:t>
+      </w:r>
+      <w:r>
+        <w:t xml:space="preserve">US-Hyperscalern, sondern Migration</w:t>
+      </w:r>
+      <w:r>
+        <w:t xml:space="preserve"> </w:t>
+      </w:r>
+      <w:r>
+        <w:rPr>
+          <w:iCs/>
+          <w:i/>
+        </w:rPr>
+        <w:t xml:space="preserve">hin zu</w:t>
+      </w:r>
+      <w:r>
+        <w:t xml:space="preserve"> </w:t>
+      </w:r>
+      <w:r>
+        <w:t xml:space="preserve">ihnen.</w:t>
+      </w:r>
+    </w:p>
+    <w:p>
+      <w:pPr>
+        <w:pStyle w:val="BodyText"/>
+      </w:pPr>
+      <w:r>
+        <w:t xml:space="preserve">Warum? Weil die Service-Tiefe und das integrierte Ökosystem der US-Hyperscaler im Beschaffungsprozess schwer zu schlagen sind. AWS und Azure bieten je über 200 verwaltete Dienste (Managed Databases, Serverless, IoT/Edge, DevOps-Toolchains, Data Warehouse, globale CDN) — EU-Anbieter wie STACKIT bieten 40–60 Kernservices. Für eine GKV, die erstmals eine Cloud-basierte KI-Plattform oder ein Analytics-System aufbauen will, ist Azure der Weg des geringsten Widerstands: ein Anbieter, ein Vertrag, ein Ökosystem mit E-Mail, Identity, Collaboration, Datenbanken, KI-Services und Entwicklertools in einer integrierten Umgebung. § 393 SGB V mit C5-Testat gibt die formale Erlaubnis, und die Vertriebsteams der Hyperscaler liefern Proof-of-Concept-Infrastruktur, KHZG-Beratung und Förderbudgets gleich mit (§1.2.5).</w:t>
+      </w:r>
+    </w:p>
+    <w:p>
+      <w:pPr>
+        <w:pStyle w:val="BodyText"/>
+      </w:pPr>
+      <w:r>
+        <w:t xml:space="preserve">Das Problem entsteht nicht beim Einstieg — es entsteht danach. Jeder Azure-Managed-Service, jedes proprietäre API, jeder Microsoft-365-Workflow, der mit Patientendaten arbeitet, vertieft die Abhängigkeit. Nach 12–24 Monaten ist die Organisation in 15–20 integrierte Schichten eingebettet — E-Mail, Identity, Collaboration, Datenbanken, KI. Wer dann aufgrund eines Schrems-III-Urteils, einer Aufsichtsverfügung oder einer geopolitischen Eskalation wechseln muss, steht vor einem Mehrjahresprojekt. Die Drei-Zonen-Migrationsstrategie in §17.3 adressiert genau dieses Szenario — aber sie funktioniert nur, wenn die Exit-Option von Anfang an mitgeplant wird, nicht erst wenn der Druck da ist. Details zur Service-Tiefe in Kapitel 7, zur Exit-Strategie in §17.6.</w:t>
       </w:r>
     </w:p>
     <w:bookmarkEnd w:id="23"/>

</xml_diff>

<commit_message>
§1.2.1: Meta-Kommentar entfernt, direkt mit konkreten Beispielen eröffnet
https://claude.ai/code/session_01PFeLNnCR3FrQPcaZf8Mc5W
</commit_message>
<xml_diff>
--- a/Wolkenfrei.docx
+++ b/Wolkenfrei.docx
@@ -1218,47 +1218,7 @@
         <w:pStyle w:val="FirstParagraph"/>
       </w:pPr>
       <w:r>
-        <w:t xml:space="preserve">Die meisten Gesundheitsinstitutionen stehen nicht vor der Frage, wie sie aus einer US-Cloud herauskommen — sie steigen gerade erst ein. Die KVNO baut ihre KI-Plattform auf Azure (TED 98706-2026). Kubus IT migriert GKV-Infrastruktur über Arvato zu Google Cloud. Kliniken evaluieren Oracle Cerner auf OCI. Der Trend ist nicht Migration</w:t>
-      </w:r>
-      <w:r>
-        <w:t xml:space="preserve"> </w:t>
-      </w:r>
-      <w:r>
-        <w:rPr>
-          <w:iCs/>
-          <w:i/>
-        </w:rPr>
-        <w:t xml:space="preserve">weg von</w:t>
-      </w:r>
-      <w:r>
-        <w:t xml:space="preserve"> </w:t>
-      </w:r>
-      <w:r>
-        <w:t xml:space="preserve">US-Hyperscalern, sondern Migration</w:t>
-      </w:r>
-      <w:r>
-        <w:t xml:space="preserve"> </w:t>
-      </w:r>
-      <w:r>
-        <w:rPr>
-          <w:iCs/>
-          <w:i/>
-        </w:rPr>
-        <w:t xml:space="preserve">hin zu</w:t>
-      </w:r>
-      <w:r>
-        <w:t xml:space="preserve"> </w:t>
-      </w:r>
-      <w:r>
-        <w:t xml:space="preserve">ihnen.</w:t>
-      </w:r>
-    </w:p>
-    <w:p>
-      <w:pPr>
-        <w:pStyle w:val="BodyText"/>
-      </w:pPr>
-      <w:r>
-        <w:t xml:space="preserve">Warum? Weil die Service-Tiefe und das integrierte Ökosystem der US-Hyperscaler im Beschaffungsprozess schwer zu schlagen sind. AWS und Azure bieten je über 200 verwaltete Dienste (Managed Databases, Serverless, IoT/Edge, DevOps-Toolchains, Data Warehouse, globale CDN) — EU-Anbieter wie STACKIT bieten 40–60 Kernservices. Für eine GKV, die erstmals eine Cloud-basierte KI-Plattform oder ein Analytics-System aufbauen will, ist Azure der Weg des geringsten Widerstands: ein Anbieter, ein Vertrag, ein Ökosystem mit E-Mail, Identity, Collaboration, Datenbanken, KI-Services und Entwicklertools in einer integrierten Umgebung. § 393 SGB V mit C5-Testat gibt die formale Erlaubnis, und die Vertriebsteams der Hyperscaler liefern Proof-of-Concept-Infrastruktur, KHZG-Beratung und Förderbudgets gleich mit (§1.2.5).</w:t>
+        <w:t xml:space="preserve">Die KVNO baut ihre KI-Plattform auf Azure (TED 98706-2026). Kubus IT migriert GKV-Infrastruktur über Arvato zu Google Cloud. Kliniken evaluieren Oracle Cerner auf OCI. Die Sogwirkung ist real: AWS und Azure bieten je über 200 verwaltete Dienste (Managed Databases, Serverless, IoT/Edge, DevOps-Toolchains, Data Warehouse, globale CDN) — EU-Anbieter wie STACKIT bieten 40–60 Kernservices. Für eine GKV, die erstmals eine Cloud-basierte KI-Plattform oder ein Analytics-System aufbauen will, ist Azure der Weg des geringsten Widerstands: ein Anbieter, ein Vertrag, ein Ökosystem mit E-Mail, Identity, Collaboration, Datenbanken, KI-Services und Entwicklertools in einer integrierten Umgebung. § 393 SGB V mit C5-Testat gibt die formale Erlaubnis, und die Vertriebsteams der Hyperscaler liefern Proof-of-Concept-Infrastruktur, KHZG-Beratung und Förderbudgets gleich mit (§1.2.5).</w:t>
       </w:r>
     </w:p>
     <w:p>

</xml_diff>